<commit_message>
Daily standup meetings. Transferred from Notion into Word docs.
</commit_message>
<xml_diff>
--- a/docs/Report/Mains_Report.docx
+++ b/docs/Report/Mains_Report.docx
@@ -285,7 +285,7 @@
               </mc:Choice>
               <mc:Fallback>
                 <w:pict>
-                  <v:group w14:anchorId="76897AB3" id="Group 157" o:spid="_x0000_s1026" style="position:absolute;margin-left:0;margin-top:0;width:8in;height:95.7pt;z-index:251662336;mso-width-percent:941;mso-height-percent:121;mso-top-percent:23;mso-position-horizontal:center;mso-position-horizontal-relative:page;mso-position-vertical-relative:page;mso-width-percent:941;mso-height-percent:121;mso-top-percent:23" coordorigin="" coordsize="73152,12161" o:gfxdata="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">
+                  <v:group w14:anchorId="60F9E2BC" id="Group 157" o:spid="_x0000_s1026" style="position:absolute;margin-left:0;margin-top:0;width:8in;height:95.7pt;z-index:251662336;mso-width-percent:941;mso-height-percent:121;mso-top-percent:23;mso-position-horizontal:center;mso-position-horizontal-relative:page;mso-position-vertical-relative:page;mso-width-percent:941;mso-height-percent:121;mso-top-percent:23" coordorigin="" coordsize="73152,12161" o:gfxdata="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">
                     <v:shape id="Rectangle 51" o:spid="_x0000_s1027" style="position:absolute;width:73152;height:11303;visibility:visible;mso-wrap-style:square;v-text-anchor:middle" coordsize="7312660,1129665" o:gfxdata="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" path="m,l7312660,r,1129665l3619500,733425,,1091565,,xe" fillcolor="#156082 [3204]" stroked="f" strokeweight="1pt">
                       <v:stroke joinstyle="miter"/>
                       <v:path arrowok="t" o:connecttype="custom" o:connectlocs="0,0;7315200,0;7315200,1130373;3620757,733885;0,1092249;0,0" o:connectangles="0,0,0,0,0,0"/>
@@ -4382,15 +4382,33 @@
           <w:sz w:val="22"/>
           <w:szCs w:val="22"/>
         </w:rPr>
-        <w:t xml:space="preserve"> auction logic</w:t>
-      </w:r>
-      <w:r>
-        <w:rPr>
-          <w:rFonts w:ascii="Calibri" w:hAnsi="Calibri" w:cs="Calibri"/>
-          <w:sz w:val="22"/>
-          <w:szCs w:val="22"/>
-        </w:rPr>
-        <w:t>, and is built on .NET10 with Blazor Server</w:t>
+        <w:t xml:space="preserve"> auction </w:t>
+      </w:r>
+      <w:proofErr w:type="gramStart"/>
+      <w:r>
+        <w:rPr>
+          <w:rFonts w:ascii="Calibri" w:hAnsi="Calibri" w:cs="Calibri"/>
+          <w:sz w:val="22"/>
+          <w:szCs w:val="22"/>
+        </w:rPr>
+        <w:t>logic</w:t>
+      </w:r>
+      <w:r>
+        <w:rPr>
+          <w:rFonts w:ascii="Calibri" w:hAnsi="Calibri" w:cs="Calibri"/>
+          <w:sz w:val="22"/>
+          <w:szCs w:val="22"/>
+        </w:rPr>
+        <w:t>, and</w:t>
+      </w:r>
+      <w:proofErr w:type="gramEnd"/>
+      <w:r>
+        <w:rPr>
+          <w:rFonts w:ascii="Calibri" w:hAnsi="Calibri" w:cs="Calibri"/>
+          <w:sz w:val="22"/>
+          <w:szCs w:val="22"/>
+        </w:rPr>
+        <w:t xml:space="preserve"> is built on .NET10 with Blazor Server</w:t>
       </w:r>
       <w:r>
         <w:rPr>
@@ -4774,7 +4792,25 @@
           <w:sz w:val="22"/>
           <w:szCs w:val="22"/>
         </w:rPr>
-        <w:t>A Binary Search Tree (BST) was selected to store auction data. Auctions are frequently searched by ID and require ordered traversal for price range filtering. The BST provides O(log n) average case time complexity for insertion, search, and deletion, making it well suited to a system where auctions are regularly added and queried (</w:t>
+        <w:t xml:space="preserve">A Binary Search Tree (BST) was selected to store auction data. Auctions are frequently searched by ID and require ordered traversal for price range filtering. The BST provides </w:t>
+      </w:r>
+      <w:proofErr w:type="gramStart"/>
+      <w:r>
+        <w:rPr>
+          <w:rFonts w:ascii="Calibri" w:hAnsi="Calibri" w:cs="Calibri"/>
+          <w:sz w:val="22"/>
+          <w:szCs w:val="22"/>
+        </w:rPr>
+        <w:t>O(</w:t>
+      </w:r>
+      <w:proofErr w:type="gramEnd"/>
+      <w:r>
+        <w:rPr>
+          <w:rFonts w:ascii="Calibri" w:hAnsi="Calibri" w:cs="Calibri"/>
+          <w:sz w:val="22"/>
+          <w:szCs w:val="22"/>
+        </w:rPr>
+        <w:t>log n) average case time complexity for insertion, search, and deletion, making it well suited to a system where auctions are regularly added and queried (</w:t>
       </w:r>
       <w:proofErr w:type="spellStart"/>
       <w:r>
@@ -4827,7 +4863,25 @@
           <w:sz w:val="22"/>
           <w:szCs w:val="22"/>
         </w:rPr>
-        <w:t xml:space="preserve">A Hash Table was selected to store user data, implemented with separate chaining for collision resolution. User authentication requires fast lookup by username and the hash table provides O(1) average case search and insertion (Knuth, 1998; </w:t>
+        <w:t xml:space="preserve">A Hash Table was selected to store user data, implemented with separate chaining for collision resolution. User authentication requires fast lookup by username and the hash table provides </w:t>
+      </w:r>
+      <w:proofErr w:type="gramStart"/>
+      <w:r>
+        <w:rPr>
+          <w:rFonts w:ascii="Calibri" w:hAnsi="Calibri" w:cs="Calibri"/>
+          <w:sz w:val="22"/>
+          <w:szCs w:val="22"/>
+        </w:rPr>
+        <w:t>O(</w:t>
+      </w:r>
+      <w:proofErr w:type="gramEnd"/>
+      <w:r>
+        <w:rPr>
+          <w:rFonts w:ascii="Calibri" w:hAnsi="Calibri" w:cs="Calibri"/>
+          <w:sz w:val="22"/>
+          <w:szCs w:val="22"/>
+        </w:rPr>
+        <w:t xml:space="preserve">1) average case search and insertion (Knuth, 1998; </w:t>
       </w:r>
       <w:proofErr w:type="spellStart"/>
       <w:r>
@@ -4845,7 +4899,43 @@
           <w:sz w:val="22"/>
           <w:szCs w:val="22"/>
         </w:rPr>
-        <w:t xml:space="preserve">, 2024). A BST was considered but rejected for user storage as there is no requirement to traverse users in sorted order, making the O(1) hash table preferable over O(log n) BST lookup. The implementation auto </w:t>
+        <w:t xml:space="preserve">, 2024). A BST was considered but rejected for user storage as there is no requirement to traverse users in sorted order, making the </w:t>
+      </w:r>
+      <w:proofErr w:type="gramStart"/>
+      <w:r>
+        <w:rPr>
+          <w:rFonts w:ascii="Calibri" w:hAnsi="Calibri" w:cs="Calibri"/>
+          <w:sz w:val="22"/>
+          <w:szCs w:val="22"/>
+        </w:rPr>
+        <w:t>O(</w:t>
+      </w:r>
+      <w:proofErr w:type="gramEnd"/>
+      <w:r>
+        <w:rPr>
+          <w:rFonts w:ascii="Calibri" w:hAnsi="Calibri" w:cs="Calibri"/>
+          <w:sz w:val="22"/>
+          <w:szCs w:val="22"/>
+        </w:rPr>
+        <w:t xml:space="preserve">1) hash table preferable over </w:t>
+      </w:r>
+      <w:proofErr w:type="gramStart"/>
+      <w:r>
+        <w:rPr>
+          <w:rFonts w:ascii="Calibri" w:hAnsi="Calibri" w:cs="Calibri"/>
+          <w:sz w:val="22"/>
+          <w:szCs w:val="22"/>
+        </w:rPr>
+        <w:t>O(</w:t>
+      </w:r>
+      <w:proofErr w:type="gramEnd"/>
+      <w:r>
+        <w:rPr>
+          <w:rFonts w:ascii="Calibri" w:hAnsi="Calibri" w:cs="Calibri"/>
+          <w:sz w:val="22"/>
+          <w:szCs w:val="22"/>
+        </w:rPr>
+        <w:t xml:space="preserve">log n) BST lookup. The implementation auto </w:t>
       </w:r>
       <w:proofErr w:type="spellStart"/>
       <w:r>
@@ -4880,7 +4970,25 @@
           <w:sz w:val="22"/>
           <w:szCs w:val="22"/>
         </w:rPr>
-        <w:t xml:space="preserve">A custom Linked List was selected to store bid history for each auction. Bids are always appended and retrieved in sequence and the linked list supports O(1) insertion at the head and O(n) full traversal to retrieve history or find the highest bid (Sedgewick and Wayne, 2011). A dynamic array was considered but rejected due to </w:t>
+        <w:t xml:space="preserve">A custom Linked List was selected to store bid history for each auction. Bids are always appended and retrieved in sequence and the linked list supports </w:t>
+      </w:r>
+      <w:proofErr w:type="gramStart"/>
+      <w:r>
+        <w:rPr>
+          <w:rFonts w:ascii="Calibri" w:hAnsi="Calibri" w:cs="Calibri"/>
+          <w:sz w:val="22"/>
+          <w:szCs w:val="22"/>
+        </w:rPr>
+        <w:t>O(</w:t>
+      </w:r>
+      <w:proofErr w:type="gramEnd"/>
+      <w:r>
+        <w:rPr>
+          <w:rFonts w:ascii="Calibri" w:hAnsi="Calibri" w:cs="Calibri"/>
+          <w:sz w:val="22"/>
+          <w:szCs w:val="22"/>
+        </w:rPr>
+        <w:t xml:space="preserve">1) insertion at the head and O(n) full traversal to retrieve history or find the highest bid (Sedgewick and Wayne, 2011). A dynamic array was considered but rejected due to </w:t>
       </w:r>
       <w:proofErr w:type="spellStart"/>
       <w:r>
@@ -4898,7 +5006,25 @@
           <w:sz w:val="22"/>
           <w:szCs w:val="22"/>
         </w:rPr>
-        <w:t xml:space="preserve"> overhead. Since bid counts are unpredictable and growth is append only, the linked list is the more appropriate choice</w:t>
+        <w:t xml:space="preserve"> overhead. Since bid counts are unpredictable and growth is </w:t>
+      </w:r>
+      <w:proofErr w:type="gramStart"/>
+      <w:r>
+        <w:rPr>
+          <w:rFonts w:ascii="Calibri" w:hAnsi="Calibri" w:cs="Calibri"/>
+          <w:sz w:val="22"/>
+          <w:szCs w:val="22"/>
+        </w:rPr>
+        <w:t>append</w:t>
+      </w:r>
+      <w:proofErr w:type="gramEnd"/>
+      <w:r>
+        <w:rPr>
+          <w:rFonts w:ascii="Calibri" w:hAnsi="Calibri" w:cs="Calibri"/>
+          <w:sz w:val="22"/>
+          <w:szCs w:val="22"/>
+        </w:rPr>
+        <w:t xml:space="preserve"> only, the linked list is the more appropriate choice</w:t>
       </w:r>
     </w:p>
     <w:p>
@@ -4955,7 +5081,25 @@
           <w:sz w:val="22"/>
           <w:szCs w:val="22"/>
         </w:rPr>
-        <w:t>The BST insert operation locates the correct position for a new auction by comparing the auction ID against each node, traversing left if the new ID is smaller and right if it is larger, until a null position is found. This recursive process gives an average time complexity of O(log n) as each comparison eliminates approximately half the remaining tree. In the worst case, if auctions are inserted in sorted order, the tree degenerates into a linear chain giving O(n) complexity (</w:t>
+        <w:t xml:space="preserve">The BST insert operation locates the correct position for a new auction by comparing the auction ID against each node, traversing left if the new ID is smaller and right if it is larger, until a null position is found. This recursive process gives an average time complexity of </w:t>
+      </w:r>
+      <w:proofErr w:type="gramStart"/>
+      <w:r>
+        <w:rPr>
+          <w:rFonts w:ascii="Calibri" w:hAnsi="Calibri" w:cs="Calibri"/>
+          <w:sz w:val="22"/>
+          <w:szCs w:val="22"/>
+        </w:rPr>
+        <w:t>O(</w:t>
+      </w:r>
+      <w:proofErr w:type="gramEnd"/>
+      <w:r>
+        <w:rPr>
+          <w:rFonts w:ascii="Calibri" w:hAnsi="Calibri" w:cs="Calibri"/>
+          <w:sz w:val="22"/>
+          <w:szCs w:val="22"/>
+        </w:rPr>
+        <w:t>log n) as each comparison eliminates approximately half the remaining tree. In the worst case, if auctions are inserted in sorted order, the tree degenerates into a linear chain giving O(n) complexity (</w:t>
       </w:r>
       <w:proofErr w:type="spellStart"/>
       <w:r>
@@ -4997,6 +5141,8 @@
       <w:pPr>
         <w:rPr>
           <w:rFonts w:ascii="Calibri" w:hAnsi="Calibri" w:cs="Calibri"/>
+          <w:i/>
+          <w:iCs/>
           <w:sz w:val="22"/>
           <w:szCs w:val="22"/>
         </w:rPr>
@@ -5004,16 +5150,42 @@
       <w:r>
         <w:rPr>
           <w:rFonts w:ascii="Calibri" w:hAnsi="Calibri" w:cs="Calibri"/>
-          <w:sz w:val="22"/>
-          <w:szCs w:val="22"/>
-        </w:rPr>
-        <w:t>FUNCTION Insert(node, auction):</w:t>
+          <w:i/>
+          <w:iCs/>
+          <w:sz w:val="22"/>
+          <w:szCs w:val="22"/>
+        </w:rPr>
+        <w:t xml:space="preserve">FUNCTION </w:t>
+      </w:r>
+      <w:proofErr w:type="gramStart"/>
+      <w:r>
+        <w:rPr>
+          <w:rFonts w:ascii="Calibri" w:hAnsi="Calibri" w:cs="Calibri"/>
+          <w:i/>
+          <w:iCs/>
+          <w:sz w:val="22"/>
+          <w:szCs w:val="22"/>
+        </w:rPr>
+        <w:t>Insert(</w:t>
+      </w:r>
+      <w:proofErr w:type="gramEnd"/>
+      <w:r>
+        <w:rPr>
+          <w:rFonts w:ascii="Calibri" w:hAnsi="Calibri" w:cs="Calibri"/>
+          <w:i/>
+          <w:iCs/>
+          <w:sz w:val="22"/>
+          <w:szCs w:val="22"/>
+        </w:rPr>
+        <w:t>node, auction):</w:t>
       </w:r>
     </w:p>
     <w:p>
       <w:pPr>
         <w:rPr>
           <w:rFonts w:ascii="Calibri" w:hAnsi="Calibri" w:cs="Calibri"/>
+          <w:i/>
+          <w:iCs/>
           <w:sz w:val="22"/>
           <w:szCs w:val="22"/>
         </w:rPr>
@@ -5021,6 +5193,8 @@
       <w:r>
         <w:rPr>
           <w:rFonts w:ascii="Calibri" w:hAnsi="Calibri" w:cs="Calibri"/>
+          <w:i/>
+          <w:iCs/>
           <w:sz w:val="22"/>
           <w:szCs w:val="22"/>
         </w:rPr>
@@ -5031,6 +5205,8 @@
       <w:pPr>
         <w:rPr>
           <w:rFonts w:ascii="Calibri" w:hAnsi="Calibri" w:cs="Calibri"/>
+          <w:i/>
+          <w:iCs/>
           <w:sz w:val="22"/>
           <w:szCs w:val="22"/>
         </w:rPr>
@@ -5038,6 +5214,8 @@
       <w:r>
         <w:rPr>
           <w:rFonts w:ascii="Calibri" w:hAnsi="Calibri" w:cs="Calibri"/>
+          <w:i/>
+          <w:iCs/>
           <w:sz w:val="22"/>
           <w:szCs w:val="22"/>
         </w:rPr>
@@ -5048,6 +5226,8 @@
       <w:pPr>
         <w:rPr>
           <w:rFonts w:ascii="Calibri" w:hAnsi="Calibri" w:cs="Calibri"/>
+          <w:i/>
+          <w:iCs/>
           <w:sz w:val="22"/>
           <w:szCs w:val="22"/>
         </w:rPr>
@@ -5055,6 +5235,8 @@
       <w:r>
         <w:rPr>
           <w:rFonts w:ascii="Calibri" w:hAnsi="Calibri" w:cs="Calibri"/>
+          <w:i/>
+          <w:iCs/>
           <w:sz w:val="22"/>
           <w:szCs w:val="22"/>
         </w:rPr>
@@ -5065,6 +5247,8 @@
       <w:pPr>
         <w:rPr>
           <w:rFonts w:ascii="Calibri" w:hAnsi="Calibri" w:cs="Calibri"/>
+          <w:i/>
+          <w:iCs/>
           <w:sz w:val="22"/>
           <w:szCs w:val="22"/>
         </w:rPr>
@@ -5072,6 +5256,8 @@
       <w:r>
         <w:rPr>
           <w:rFonts w:ascii="Calibri" w:hAnsi="Calibri" w:cs="Calibri"/>
+          <w:i/>
+          <w:iCs/>
           <w:sz w:val="22"/>
           <w:szCs w:val="22"/>
         </w:rPr>
@@ -5082,41 +5268,65 @@
       <w:pPr>
         <w:rPr>
           <w:rFonts w:ascii="Calibri" w:hAnsi="Calibri" w:cs="Calibri"/>
+          <w:i/>
+          <w:iCs/>
           <w:sz w:val="22"/>
           <w:szCs w:val="22"/>
         </w:rPr>
       </w:pPr>
       <w:proofErr w:type="spellStart"/>
-      <w:r>
-        <w:rPr>
-          <w:rFonts w:ascii="Calibri" w:hAnsi="Calibri" w:cs="Calibri"/>
+      <w:proofErr w:type="gramStart"/>
+      <w:r>
+        <w:rPr>
+          <w:rFonts w:ascii="Calibri" w:hAnsi="Calibri" w:cs="Calibri"/>
+          <w:i/>
+          <w:iCs/>
           <w:sz w:val="22"/>
           <w:szCs w:val="22"/>
         </w:rPr>
         <w:t>node.left</w:t>
       </w:r>
       <w:proofErr w:type="spellEnd"/>
-      <w:r>
-        <w:rPr>
-          <w:rFonts w:ascii="Calibri" w:hAnsi="Calibri" w:cs="Calibri"/>
-          <w:sz w:val="22"/>
-          <w:szCs w:val="22"/>
-        </w:rPr>
-        <w:t xml:space="preserve"> &lt;-- Insert(</w:t>
+      <w:proofErr w:type="gramEnd"/>
+      <w:r>
+        <w:rPr>
+          <w:rFonts w:ascii="Calibri" w:hAnsi="Calibri" w:cs="Calibri"/>
+          <w:i/>
+          <w:iCs/>
+          <w:sz w:val="22"/>
+          <w:szCs w:val="22"/>
+        </w:rPr>
+        <w:t xml:space="preserve"> &lt;-- </w:t>
+      </w:r>
+      <w:proofErr w:type="gramStart"/>
+      <w:r>
+        <w:rPr>
+          <w:rFonts w:ascii="Calibri" w:hAnsi="Calibri" w:cs="Calibri"/>
+          <w:i/>
+          <w:iCs/>
+          <w:sz w:val="22"/>
+          <w:szCs w:val="22"/>
+        </w:rPr>
+        <w:t>Insert(</w:t>
       </w:r>
       <w:proofErr w:type="spellStart"/>
       <w:r>
         <w:rPr>
           <w:rFonts w:ascii="Calibri" w:hAnsi="Calibri" w:cs="Calibri"/>
+          <w:i/>
+          <w:iCs/>
           <w:sz w:val="22"/>
           <w:szCs w:val="22"/>
         </w:rPr>
         <w:t>node.left</w:t>
       </w:r>
       <w:proofErr w:type="spellEnd"/>
-      <w:r>
-        <w:rPr>
-          <w:rFonts w:ascii="Calibri" w:hAnsi="Calibri" w:cs="Calibri"/>
+      <w:proofErr w:type="gramEnd"/>
+      <w:r>
+        <w:rPr>
+          <w:rFonts w:ascii="Calibri" w:hAnsi="Calibri" w:cs="Calibri"/>
+          <w:i/>
+          <w:iCs/>
           <w:sz w:val="22"/>
           <w:szCs w:val="22"/>
         </w:rPr>
@@ -5127,6 +5337,8 @@
       <w:pPr>
         <w:rPr>
           <w:rFonts w:ascii="Calibri" w:hAnsi="Calibri" w:cs="Calibri"/>
+          <w:i/>
+          <w:iCs/>
           <w:sz w:val="22"/>
           <w:szCs w:val="22"/>
         </w:rPr>
@@ -5134,6 +5346,8 @@
       <w:r>
         <w:rPr>
           <w:rFonts w:ascii="Calibri" w:hAnsi="Calibri" w:cs="Calibri"/>
+          <w:i/>
+          <w:iCs/>
           <w:sz w:val="22"/>
           <w:szCs w:val="22"/>
         </w:rPr>
@@ -5144,41 +5358,65 @@
       <w:pPr>
         <w:rPr>
           <w:rFonts w:ascii="Calibri" w:hAnsi="Calibri" w:cs="Calibri"/>
+          <w:i/>
+          <w:iCs/>
           <w:sz w:val="22"/>
           <w:szCs w:val="22"/>
         </w:rPr>
       </w:pPr>
       <w:proofErr w:type="spellStart"/>
-      <w:r>
-        <w:rPr>
-          <w:rFonts w:ascii="Calibri" w:hAnsi="Calibri" w:cs="Calibri"/>
+      <w:proofErr w:type="gramStart"/>
+      <w:r>
+        <w:rPr>
+          <w:rFonts w:ascii="Calibri" w:hAnsi="Calibri" w:cs="Calibri"/>
+          <w:i/>
+          <w:iCs/>
           <w:sz w:val="22"/>
           <w:szCs w:val="22"/>
         </w:rPr>
         <w:t>node.right</w:t>
       </w:r>
       <w:proofErr w:type="spellEnd"/>
-      <w:r>
-        <w:rPr>
-          <w:rFonts w:ascii="Calibri" w:hAnsi="Calibri" w:cs="Calibri"/>
-          <w:sz w:val="22"/>
-          <w:szCs w:val="22"/>
-        </w:rPr>
-        <w:t xml:space="preserve"> &lt;-- Insert(</w:t>
+      <w:proofErr w:type="gramEnd"/>
+      <w:r>
+        <w:rPr>
+          <w:rFonts w:ascii="Calibri" w:hAnsi="Calibri" w:cs="Calibri"/>
+          <w:i/>
+          <w:iCs/>
+          <w:sz w:val="22"/>
+          <w:szCs w:val="22"/>
+        </w:rPr>
+        <w:t xml:space="preserve"> &lt;-- </w:t>
+      </w:r>
+      <w:proofErr w:type="gramStart"/>
+      <w:r>
+        <w:rPr>
+          <w:rFonts w:ascii="Calibri" w:hAnsi="Calibri" w:cs="Calibri"/>
+          <w:i/>
+          <w:iCs/>
+          <w:sz w:val="22"/>
+          <w:szCs w:val="22"/>
+        </w:rPr>
+        <w:t>Insert(</w:t>
       </w:r>
       <w:proofErr w:type="spellStart"/>
       <w:r>
         <w:rPr>
           <w:rFonts w:ascii="Calibri" w:hAnsi="Calibri" w:cs="Calibri"/>
+          <w:i/>
+          <w:iCs/>
           <w:sz w:val="22"/>
           <w:szCs w:val="22"/>
         </w:rPr>
         <w:t>node.right</w:t>
       </w:r>
       <w:proofErr w:type="spellEnd"/>
-      <w:r>
-        <w:rPr>
-          <w:rFonts w:ascii="Calibri" w:hAnsi="Calibri" w:cs="Calibri"/>
+      <w:proofErr w:type="gramEnd"/>
+      <w:r>
+        <w:rPr>
+          <w:rFonts w:ascii="Calibri" w:hAnsi="Calibri" w:cs="Calibri"/>
+          <w:i/>
+          <w:iCs/>
           <w:sz w:val="22"/>
           <w:szCs w:val="22"/>
         </w:rPr>
@@ -5189,6 +5427,8 @@
       <w:pPr>
         <w:rPr>
           <w:rFonts w:ascii="Calibri" w:hAnsi="Calibri" w:cs="Calibri"/>
+          <w:i/>
+          <w:iCs/>
           <w:sz w:val="22"/>
           <w:szCs w:val="22"/>
         </w:rPr>
@@ -5196,6 +5436,8 @@
       <w:r>
         <w:rPr>
           <w:rFonts w:ascii="Calibri" w:hAnsi="Calibri" w:cs="Calibri"/>
+          <w:i/>
+          <w:iCs/>
           <w:sz w:val="22"/>
           <w:szCs w:val="22"/>
         </w:rPr>
@@ -5206,6 +5448,8 @@
       <w:pPr>
         <w:rPr>
           <w:rFonts w:ascii="Calibri" w:hAnsi="Calibri" w:cs="Calibri"/>
+          <w:i/>
+          <w:iCs/>
           <w:sz w:val="22"/>
           <w:szCs w:val="22"/>
         </w:rPr>
@@ -5213,6 +5457,8 @@
       <w:r>
         <w:rPr>
           <w:rFonts w:ascii="Calibri" w:hAnsi="Calibri" w:cs="Calibri"/>
+          <w:i/>
+          <w:iCs/>
           <w:sz w:val="22"/>
           <w:szCs w:val="22"/>
         </w:rPr>
@@ -5223,6 +5469,8 @@
       <w:pPr>
         <w:rPr>
           <w:rFonts w:ascii="Calibri" w:hAnsi="Calibri" w:cs="Calibri"/>
+          <w:i/>
+          <w:iCs/>
           <w:sz w:val="22"/>
           <w:szCs w:val="22"/>
         </w:rPr>
@@ -5230,6 +5478,8 @@
       <w:r>
         <w:rPr>
           <w:rFonts w:ascii="Calibri" w:hAnsi="Calibri" w:cs="Calibri"/>
+          <w:i/>
+          <w:iCs/>
           <w:sz w:val="22"/>
           <w:szCs w:val="22"/>
         </w:rPr>
@@ -5270,7 +5520,25 @@
           <w:sz w:val="22"/>
           <w:szCs w:val="22"/>
         </w:rPr>
-        <w:t>Search operates identically to insert, comparing the target auction ID against each node and traversing left or right accordingly. The search terminates either when the target ID is found or a null node is reached, indicating the auction does not exist. Average time complexity is O(log n), with the same O(n) worst case for a degenerate tree.</w:t>
+        <w:t xml:space="preserve">Search operates identically to insert, comparing the target auction ID against each node and traversing left or right accordingly. The search terminates either when the target ID is found or a null node is reached, indicating the auction does not exist. Average time complexity is </w:t>
+      </w:r>
+      <w:proofErr w:type="gramStart"/>
+      <w:r>
+        <w:rPr>
+          <w:rFonts w:ascii="Calibri" w:hAnsi="Calibri" w:cs="Calibri"/>
+          <w:sz w:val="22"/>
+          <w:szCs w:val="22"/>
+        </w:rPr>
+        <w:t>O(</w:t>
+      </w:r>
+      <w:proofErr w:type="gramEnd"/>
+      <w:r>
+        <w:rPr>
+          <w:rFonts w:ascii="Calibri" w:hAnsi="Calibri" w:cs="Calibri"/>
+          <w:sz w:val="22"/>
+          <w:szCs w:val="22"/>
+        </w:rPr>
+        <w:t>log n), with the same O(n) worst case for a degenerate tree.</w:t>
       </w:r>
     </w:p>
     <w:p>
@@ -5307,7 +5575,25 @@
           <w:sz w:val="22"/>
           <w:szCs w:val="22"/>
         </w:rPr>
-        <w:t xml:space="preserve">The price range query traverses the entire tree in O(n), visiting every node and collecting auctions whose current highest bid falls within the specified minimum and maximum. A full traversal is necessary because price is not the BST ordering key. The tree is ordered by auction ID, so there is no way to eliminate subtrees based on price alone. This is an accepted trade off as the BST is </w:t>
+        <w:t xml:space="preserve">The price range query traverses the entire tree in O(n), visiting every node and collecting auctions whose current highest bid falls within the specified minimum and maximum. A full </w:t>
+      </w:r>
+      <w:proofErr w:type="gramStart"/>
+      <w:r>
+        <w:rPr>
+          <w:rFonts w:ascii="Calibri" w:hAnsi="Calibri" w:cs="Calibri"/>
+          <w:sz w:val="22"/>
+          <w:szCs w:val="22"/>
+        </w:rPr>
+        <w:t>traversal</w:t>
+      </w:r>
+      <w:proofErr w:type="gramEnd"/>
+      <w:r>
+        <w:rPr>
+          <w:rFonts w:ascii="Calibri" w:hAnsi="Calibri" w:cs="Calibri"/>
+          <w:sz w:val="22"/>
+          <w:szCs w:val="22"/>
+        </w:rPr>
+        <w:t xml:space="preserve"> is necessary because price is not the BST ordering key. The tree is ordered by auction ID, so there is no way to eliminate subtrees based on price alone. This is an accepted trade off as the BST is </w:t>
       </w:r>
       <w:proofErr w:type="spellStart"/>
       <w:r>
@@ -5325,7 +5611,25 @@
           <w:sz w:val="22"/>
           <w:szCs w:val="22"/>
         </w:rPr>
-        <w:t xml:space="preserve"> for O(log n) ID based lookup, with price range queries accepting O(n) as the cost</w:t>
+        <w:t xml:space="preserve"> for </w:t>
+      </w:r>
+      <w:proofErr w:type="gramStart"/>
+      <w:r>
+        <w:rPr>
+          <w:rFonts w:ascii="Calibri" w:hAnsi="Calibri" w:cs="Calibri"/>
+          <w:sz w:val="22"/>
+          <w:szCs w:val="22"/>
+        </w:rPr>
+        <w:t>O(</w:t>
+      </w:r>
+      <w:proofErr w:type="gramEnd"/>
+      <w:r>
+        <w:rPr>
+          <w:rFonts w:ascii="Calibri" w:hAnsi="Calibri" w:cs="Calibri"/>
+          <w:sz w:val="22"/>
+          <w:szCs w:val="22"/>
+        </w:rPr>
+        <w:t>log n) ID based lookup, with price range queries accepting O(n) as the cost</w:t>
       </w:r>
       <w:r>
         <w:rPr>
@@ -5370,7 +5674,43 @@
           <w:sz w:val="22"/>
           <w:szCs w:val="22"/>
         </w:rPr>
-        <w:t>The hash table insert operation computes a hash of the username key using a polynomial rolling hash function, producing an index into the underlying array. If a collision occurs, the new entry is prepended to the linked list at that bucket. After insertion, if the ratio of stored entries to table size exceeds the 0.75 load factor threshold, a resize operation is triggered. The average time complexity is O(1) and the worst case is O(n) if all keys hash to the same bucket, though the load factor threshold prevents this in practice (Knuth, 1998).</w:t>
+        <w:t xml:space="preserve">The hash table insert operation computes a hash of the username key using a polynomial rolling hash function, producing an index into the underlying array. If a collision occurs, the new entry is prepended to the linked list at that bucket. After insertion, if the ratio of stored entries to table size exceeds the 0.75 load factor threshold, a resize operation is triggered. The average time complexity is </w:t>
+      </w:r>
+      <w:proofErr w:type="gramStart"/>
+      <w:r>
+        <w:rPr>
+          <w:rFonts w:ascii="Calibri" w:hAnsi="Calibri" w:cs="Calibri"/>
+          <w:sz w:val="22"/>
+          <w:szCs w:val="22"/>
+        </w:rPr>
+        <w:t>O(</w:t>
+      </w:r>
+      <w:proofErr w:type="gramEnd"/>
+      <w:r>
+        <w:rPr>
+          <w:rFonts w:ascii="Calibri" w:hAnsi="Calibri" w:cs="Calibri"/>
+          <w:sz w:val="22"/>
+          <w:szCs w:val="22"/>
+        </w:rPr>
+        <w:t>1</w:t>
+      </w:r>
+      <w:proofErr w:type="gramStart"/>
+      <w:r>
+        <w:rPr>
+          <w:rFonts w:ascii="Calibri" w:hAnsi="Calibri" w:cs="Calibri"/>
+          <w:sz w:val="22"/>
+          <w:szCs w:val="22"/>
+        </w:rPr>
+        <w:t>)</w:t>
+      </w:r>
+      <w:proofErr w:type="gramEnd"/>
+      <w:r>
+        <w:rPr>
+          <w:rFonts w:ascii="Calibri" w:hAnsi="Calibri" w:cs="Calibri"/>
+          <w:sz w:val="22"/>
+          <w:szCs w:val="22"/>
+        </w:rPr>
+        <w:t xml:space="preserve"> and the worst case is O(n) if all keys hash to the same bucket, though the load factor threshold prevents this in practice (Knuth, 1998).</w:t>
       </w:r>
     </w:p>
     <w:p>
@@ -5407,7 +5747,25 @@
           <w:sz w:val="22"/>
           <w:szCs w:val="22"/>
         </w:rPr>
-        <w:t xml:space="preserve">When the load factor threshold is exceeded, the table doubles in size and all existing entries are rehashed into the new array. This operation costs O(n) as every entry must be reinserted, but occurs infrequently enough that the </w:t>
+        <w:t xml:space="preserve">When the load factor threshold is exceeded, the table doubles in size and all existing entries are rehashed into the new array. This operation costs O(n) as every entry must be </w:t>
+      </w:r>
+      <w:proofErr w:type="gramStart"/>
+      <w:r>
+        <w:rPr>
+          <w:rFonts w:ascii="Calibri" w:hAnsi="Calibri" w:cs="Calibri"/>
+          <w:sz w:val="22"/>
+          <w:szCs w:val="22"/>
+        </w:rPr>
+        <w:t>reinserted, but</w:t>
+      </w:r>
+      <w:proofErr w:type="gramEnd"/>
+      <w:r>
+        <w:rPr>
+          <w:rFonts w:ascii="Calibri" w:hAnsi="Calibri" w:cs="Calibri"/>
+          <w:sz w:val="22"/>
+          <w:szCs w:val="22"/>
+        </w:rPr>
+        <w:t xml:space="preserve"> occurs infrequently enough that the </w:t>
       </w:r>
       <w:proofErr w:type="spellStart"/>
       <w:r>
@@ -5425,7 +5783,25 @@
           <w:sz w:val="22"/>
           <w:szCs w:val="22"/>
         </w:rPr>
-        <w:t xml:space="preserve"> cost of insertion remains O(1) (</w:t>
+        <w:t xml:space="preserve"> cost of insertion remains </w:t>
+      </w:r>
+      <w:proofErr w:type="gramStart"/>
+      <w:r>
+        <w:rPr>
+          <w:rFonts w:ascii="Calibri" w:hAnsi="Calibri" w:cs="Calibri"/>
+          <w:sz w:val="22"/>
+          <w:szCs w:val="22"/>
+        </w:rPr>
+        <w:t>O(</w:t>
+      </w:r>
+      <w:proofErr w:type="gramEnd"/>
+      <w:r>
+        <w:rPr>
+          <w:rFonts w:ascii="Calibri" w:hAnsi="Calibri" w:cs="Calibri"/>
+          <w:sz w:val="22"/>
+          <w:szCs w:val="22"/>
+        </w:rPr>
+        <w:t>1) (</w:t>
       </w:r>
       <w:proofErr w:type="spellStart"/>
       <w:r>
@@ -5480,7 +5856,61 @@
           <w:sz w:val="22"/>
           <w:szCs w:val="22"/>
         </w:rPr>
-        <w:t>Search computes the hash of the target username to find the corresponding bucket, then traverses the linked list at that bucket comparing keys until a match is found or the list is exhausted. Average time complexity is O(1) and the worst case is O(n).</w:t>
+        <w:t xml:space="preserve">Search </w:t>
+      </w:r>
+      <w:proofErr w:type="gramStart"/>
+      <w:r>
+        <w:rPr>
+          <w:rFonts w:ascii="Calibri" w:hAnsi="Calibri" w:cs="Calibri"/>
+          <w:sz w:val="22"/>
+          <w:szCs w:val="22"/>
+        </w:rPr>
+        <w:t>computes</w:t>
+      </w:r>
+      <w:proofErr w:type="gramEnd"/>
+      <w:r>
+        <w:rPr>
+          <w:rFonts w:ascii="Calibri" w:hAnsi="Calibri" w:cs="Calibri"/>
+          <w:sz w:val="22"/>
+          <w:szCs w:val="22"/>
+        </w:rPr>
+        <w:t xml:space="preserve"> the hash of the target username to find the corresponding bucket, then traverses the linked list at that bucket comparing keys until a match is found or the list is exhausted. Average time complexity is </w:t>
+      </w:r>
+      <w:proofErr w:type="gramStart"/>
+      <w:r>
+        <w:rPr>
+          <w:rFonts w:ascii="Calibri" w:hAnsi="Calibri" w:cs="Calibri"/>
+          <w:sz w:val="22"/>
+          <w:szCs w:val="22"/>
+        </w:rPr>
+        <w:t>O(</w:t>
+      </w:r>
+      <w:proofErr w:type="gramEnd"/>
+      <w:r>
+        <w:rPr>
+          <w:rFonts w:ascii="Calibri" w:hAnsi="Calibri" w:cs="Calibri"/>
+          <w:sz w:val="22"/>
+          <w:szCs w:val="22"/>
+        </w:rPr>
+        <w:t>1</w:t>
+      </w:r>
+      <w:proofErr w:type="gramStart"/>
+      <w:r>
+        <w:rPr>
+          <w:rFonts w:ascii="Calibri" w:hAnsi="Calibri" w:cs="Calibri"/>
+          <w:sz w:val="22"/>
+          <w:szCs w:val="22"/>
+        </w:rPr>
+        <w:t>)</w:t>
+      </w:r>
+      <w:proofErr w:type="gramEnd"/>
+      <w:r>
+        <w:rPr>
+          <w:rFonts w:ascii="Calibri" w:hAnsi="Calibri" w:cs="Calibri"/>
+          <w:sz w:val="22"/>
+          <w:szCs w:val="22"/>
+        </w:rPr>
+        <w:t xml:space="preserve"> and the worst case is O(n).</w:t>
       </w:r>
     </w:p>
     <w:p>
@@ -5517,7 +5947,25 @@
           <w:sz w:val="22"/>
           <w:szCs w:val="22"/>
         </w:rPr>
-        <w:t>New bids are inserted at the head of the linked list by creating a new node, pointing its next reference to the current head, and updating the head pointer to the new node. This operation is always O(1) as it requires no traversal.</w:t>
+        <w:t xml:space="preserve">New bids are inserted at the head of the linked list by creating a new node, pointing its next reference to the current head, and updating the head pointer to the new node. This operation is always </w:t>
+      </w:r>
+      <w:proofErr w:type="gramStart"/>
+      <w:r>
+        <w:rPr>
+          <w:rFonts w:ascii="Calibri" w:hAnsi="Calibri" w:cs="Calibri"/>
+          <w:sz w:val="22"/>
+          <w:szCs w:val="22"/>
+        </w:rPr>
+        <w:t>O(</w:t>
+      </w:r>
+      <w:proofErr w:type="gramEnd"/>
+      <w:r>
+        <w:rPr>
+          <w:rFonts w:ascii="Calibri" w:hAnsi="Calibri" w:cs="Calibri"/>
+          <w:sz w:val="22"/>
+          <w:szCs w:val="22"/>
+        </w:rPr>
+        <w:t>1) as it requires no traversal.</w:t>
       </w:r>
     </w:p>
     <w:p>
@@ -5758,13 +6206,23 @@
                 <w:szCs w:val="18"/>
               </w:rPr>
             </w:pPr>
-            <w:r>
-              <w:rPr>
-                <w:rFonts w:ascii="Calibri" w:hAnsi="Calibri" w:cs="Calibri"/>
-                <w:sz w:val="18"/>
-                <w:szCs w:val="18"/>
-              </w:rPr>
-              <w:t>O(log n)</w:t>
+            <w:proofErr w:type="gramStart"/>
+            <w:r>
+              <w:rPr>
+                <w:rFonts w:ascii="Calibri" w:hAnsi="Calibri" w:cs="Calibri"/>
+                <w:sz w:val="18"/>
+                <w:szCs w:val="18"/>
+              </w:rPr>
+              <w:t>O(</w:t>
+            </w:r>
+            <w:proofErr w:type="gramEnd"/>
+            <w:r>
+              <w:rPr>
+                <w:rFonts w:ascii="Calibri" w:hAnsi="Calibri" w:cs="Calibri"/>
+                <w:sz w:val="18"/>
+                <w:szCs w:val="18"/>
+              </w:rPr>
+              <w:t>log n)</w:t>
             </w:r>
           </w:p>
         </w:tc>
@@ -5856,13 +6314,23 @@
                 <w:szCs w:val="18"/>
               </w:rPr>
             </w:pPr>
-            <w:r>
-              <w:rPr>
-                <w:rFonts w:ascii="Calibri" w:hAnsi="Calibri" w:cs="Calibri"/>
-                <w:sz w:val="18"/>
-                <w:szCs w:val="18"/>
-              </w:rPr>
-              <w:t>O(log n)</w:t>
+            <w:proofErr w:type="gramStart"/>
+            <w:r>
+              <w:rPr>
+                <w:rFonts w:ascii="Calibri" w:hAnsi="Calibri" w:cs="Calibri"/>
+                <w:sz w:val="18"/>
+                <w:szCs w:val="18"/>
+              </w:rPr>
+              <w:t>O(</w:t>
+            </w:r>
+            <w:proofErr w:type="gramEnd"/>
+            <w:r>
+              <w:rPr>
+                <w:rFonts w:ascii="Calibri" w:hAnsi="Calibri" w:cs="Calibri"/>
+                <w:sz w:val="18"/>
+                <w:szCs w:val="18"/>
+              </w:rPr>
+              <w:t>log n)</w:t>
             </w:r>
           </w:p>
         </w:tc>
@@ -5954,13 +6422,23 @@
                 <w:szCs w:val="18"/>
               </w:rPr>
             </w:pPr>
-            <w:r>
-              <w:rPr>
-                <w:rFonts w:ascii="Calibri" w:hAnsi="Calibri" w:cs="Calibri"/>
-                <w:sz w:val="18"/>
-                <w:szCs w:val="18"/>
-              </w:rPr>
-              <w:t>O(log n)</w:t>
+            <w:proofErr w:type="gramStart"/>
+            <w:r>
+              <w:rPr>
+                <w:rFonts w:ascii="Calibri" w:hAnsi="Calibri" w:cs="Calibri"/>
+                <w:sz w:val="18"/>
+                <w:szCs w:val="18"/>
+              </w:rPr>
+              <w:t>O(</w:t>
+            </w:r>
+            <w:proofErr w:type="gramEnd"/>
+            <w:r>
+              <w:rPr>
+                <w:rFonts w:ascii="Calibri" w:hAnsi="Calibri" w:cs="Calibri"/>
+                <w:sz w:val="18"/>
+                <w:szCs w:val="18"/>
+              </w:rPr>
+              <w:t>log n)</w:t>
             </w:r>
           </w:p>
         </w:tc>
@@ -6150,13 +6628,23 @@
                 <w:szCs w:val="18"/>
               </w:rPr>
             </w:pPr>
-            <w:r>
-              <w:rPr>
-                <w:rFonts w:ascii="Calibri" w:hAnsi="Calibri" w:cs="Calibri"/>
-                <w:sz w:val="18"/>
-                <w:szCs w:val="18"/>
-              </w:rPr>
-              <w:t>O(1)</w:t>
+            <w:proofErr w:type="gramStart"/>
+            <w:r>
+              <w:rPr>
+                <w:rFonts w:ascii="Calibri" w:hAnsi="Calibri" w:cs="Calibri"/>
+                <w:sz w:val="18"/>
+                <w:szCs w:val="18"/>
+              </w:rPr>
+              <w:t>O(</w:t>
+            </w:r>
+            <w:proofErr w:type="gramEnd"/>
+            <w:r>
+              <w:rPr>
+                <w:rFonts w:ascii="Calibri" w:hAnsi="Calibri" w:cs="Calibri"/>
+                <w:sz w:val="18"/>
+                <w:szCs w:val="18"/>
+              </w:rPr>
+              <w:t>1)</w:t>
             </w:r>
           </w:p>
         </w:tc>
@@ -6248,13 +6736,23 @@
                 <w:szCs w:val="18"/>
               </w:rPr>
             </w:pPr>
-            <w:r>
-              <w:rPr>
-                <w:rFonts w:ascii="Calibri" w:hAnsi="Calibri" w:cs="Calibri"/>
-                <w:sz w:val="18"/>
-                <w:szCs w:val="18"/>
-              </w:rPr>
-              <w:t>O(1)</w:t>
+            <w:proofErr w:type="gramStart"/>
+            <w:r>
+              <w:rPr>
+                <w:rFonts w:ascii="Calibri" w:hAnsi="Calibri" w:cs="Calibri"/>
+                <w:sz w:val="18"/>
+                <w:szCs w:val="18"/>
+              </w:rPr>
+              <w:t>O(</w:t>
+            </w:r>
+            <w:proofErr w:type="gramEnd"/>
+            <w:r>
+              <w:rPr>
+                <w:rFonts w:ascii="Calibri" w:hAnsi="Calibri" w:cs="Calibri"/>
+                <w:sz w:val="18"/>
+                <w:szCs w:val="18"/>
+              </w:rPr>
+              <w:t>1)</w:t>
             </w:r>
           </w:p>
         </w:tc>
@@ -6346,13 +6844,23 @@
                 <w:szCs w:val="18"/>
               </w:rPr>
             </w:pPr>
-            <w:r>
-              <w:rPr>
-                <w:rFonts w:ascii="Calibri" w:hAnsi="Calibri" w:cs="Calibri"/>
-                <w:sz w:val="18"/>
-                <w:szCs w:val="18"/>
-              </w:rPr>
-              <w:t>O(1)</w:t>
+            <w:proofErr w:type="gramStart"/>
+            <w:r>
+              <w:rPr>
+                <w:rFonts w:ascii="Calibri" w:hAnsi="Calibri" w:cs="Calibri"/>
+                <w:sz w:val="18"/>
+                <w:szCs w:val="18"/>
+              </w:rPr>
+              <w:t>O(</w:t>
+            </w:r>
+            <w:proofErr w:type="gramEnd"/>
+            <w:r>
+              <w:rPr>
+                <w:rFonts w:ascii="Calibri" w:hAnsi="Calibri" w:cs="Calibri"/>
+                <w:sz w:val="18"/>
+                <w:szCs w:val="18"/>
+              </w:rPr>
+              <w:t>1)</w:t>
             </w:r>
           </w:p>
         </w:tc>
@@ -6370,13 +6878,23 @@
                 <w:szCs w:val="18"/>
               </w:rPr>
             </w:pPr>
-            <w:r>
-              <w:rPr>
-                <w:rFonts w:ascii="Calibri" w:hAnsi="Calibri" w:cs="Calibri"/>
-                <w:sz w:val="18"/>
-                <w:szCs w:val="18"/>
-              </w:rPr>
-              <w:t>O(1)</w:t>
+            <w:proofErr w:type="gramStart"/>
+            <w:r>
+              <w:rPr>
+                <w:rFonts w:ascii="Calibri" w:hAnsi="Calibri" w:cs="Calibri"/>
+                <w:sz w:val="18"/>
+                <w:szCs w:val="18"/>
+              </w:rPr>
+              <w:t>O(</w:t>
+            </w:r>
+            <w:proofErr w:type="gramEnd"/>
+            <w:r>
+              <w:rPr>
+                <w:rFonts w:ascii="Calibri" w:hAnsi="Calibri" w:cs="Calibri"/>
+                <w:sz w:val="18"/>
+                <w:szCs w:val="18"/>
+              </w:rPr>
+              <w:t>1)</w:t>
             </w:r>
           </w:p>
         </w:tc>
@@ -6697,9 +7215,28 @@
           <w:sz w:val="22"/>
           <w:szCs w:val="22"/>
         </w:rPr>
-        <w:t xml:space="preserve">) powered by OpenAI's GPT-4o-mini model, which provides users with an interactive assistant capable of answering questions about the platform and the auction process. To avoid exposing the OpenAI API key within the source code or requiring markers to configure their own key to run the application, a lightweight proxy server was developed and deployed separately on Railway. The proxy server acts as a middleman between the Blazor application and the OpenAI API. When an user sends a message, the client makes an HTTP request to the proxy rather than directly to OpenAI. The proxy then forwards the request to the OpenAI API using the stored key on the server side, receives the response, and returns it to the client. This means the API key is never exposed in the repository or the compiled application. The proxy URL is stored in </w:t>
+        <w:t xml:space="preserve">) powered by OpenAI's GPT-4o-mini model, which provides users with an interactive assistant capable of answering questions about the platform and the auction process. To avoid exposing the OpenAI API key within the source code or requiring markers to configure their own key to run the application, a lightweight proxy server was developed and deployed separately on Railway. The proxy server acts as a middleman between the Blazor application and the OpenAI API. When </w:t>
+      </w:r>
+      <w:proofErr w:type="gramStart"/>
+      <w:r>
+        <w:rPr>
+          <w:rFonts w:ascii="Calibri" w:hAnsi="Calibri" w:cs="Calibri"/>
+          <w:sz w:val="22"/>
+          <w:szCs w:val="22"/>
+        </w:rPr>
+        <w:t>an</w:t>
+      </w:r>
+      <w:proofErr w:type="gramEnd"/>
+      <w:r>
+        <w:rPr>
+          <w:rFonts w:ascii="Calibri" w:hAnsi="Calibri" w:cs="Calibri"/>
+          <w:sz w:val="22"/>
+          <w:szCs w:val="22"/>
+        </w:rPr>
+        <w:t xml:space="preserve"> user sends a message, the client makes an HTTP request to the proxy rather than directly to OpenAI. The proxy then forwards the request to the OpenAI API using the stored key on the server side, receives the response, and returns it to the client. This means the API key is never exposed in the repository or the compiled application. The proxy URL is stored in </w:t>
       </w:r>
       <w:proofErr w:type="spellStart"/>
+      <w:proofErr w:type="gramStart"/>
       <w:r>
         <w:rPr>
           <w:rFonts w:ascii="Calibri" w:hAnsi="Calibri" w:cs="Calibri"/>
@@ -6709,6 +7246,7 @@
         <w:t>appsettings.json</w:t>
       </w:r>
       <w:proofErr w:type="spellEnd"/>
+      <w:proofErr w:type="gramEnd"/>
       <w:r>
         <w:rPr>
           <w:rFonts w:ascii="Calibri" w:hAnsi="Calibri" w:cs="Calibri"/>
@@ -6718,6 +7256,7 @@
         <w:t xml:space="preserve"> under the key </w:t>
       </w:r>
       <w:proofErr w:type="spellStart"/>
+      <w:proofErr w:type="gramStart"/>
       <w:r>
         <w:rPr>
           <w:rFonts w:ascii="Calibri" w:hAnsi="Calibri" w:cs="Calibri"/>
@@ -6727,6 +7266,7 @@
         <w:t>OpenAI:ProxyUrl</w:t>
       </w:r>
       <w:proofErr w:type="spellEnd"/>
+      <w:proofErr w:type="gramEnd"/>
       <w:r>
         <w:rPr>
           <w:rFonts w:ascii="Calibri" w:hAnsi="Calibri" w:cs="Calibri"/>
@@ -6958,7 +7498,25 @@
           <w:sz w:val="22"/>
           <w:szCs w:val="22"/>
         </w:rPr>
-        <w:t xml:space="preserve">A total of 91 unit tests were created. </w:t>
+        <w:t xml:space="preserve">A total of </w:t>
+      </w:r>
+      <w:proofErr w:type="gramStart"/>
+      <w:r>
+        <w:rPr>
+          <w:rFonts w:ascii="Calibri" w:hAnsi="Calibri" w:cs="Calibri"/>
+          <w:sz w:val="22"/>
+          <w:szCs w:val="22"/>
+        </w:rPr>
+        <w:t>91 unit</w:t>
+      </w:r>
+      <w:proofErr w:type="gramEnd"/>
+      <w:r>
+        <w:rPr>
+          <w:rFonts w:ascii="Calibri" w:hAnsi="Calibri" w:cs="Calibri"/>
+          <w:sz w:val="22"/>
+          <w:szCs w:val="22"/>
+        </w:rPr>
+        <w:t xml:space="preserve"> tests were created. </w:t>
       </w:r>
       <w:r>
         <w:rPr>
@@ -7300,6 +7858,7 @@
               </w:rPr>
             </w:pPr>
             <w:proofErr w:type="spellStart"/>
+            <w:proofErr w:type="gramStart"/>
             <w:r>
               <w:rPr>
                 <w:rFonts w:ascii="Calibri" w:eastAsia="Arial" w:hAnsi="Calibri" w:cs="Calibri"/>
@@ -7315,7 +7874,16 @@
                 <w:sz w:val="18"/>
                 <w:szCs w:val="18"/>
               </w:rPr>
-              <w:t>()=true, Size=0; Size=1 after insert</w:t>
+              <w:t>(</w:t>
+            </w:r>
+            <w:proofErr w:type="gramEnd"/>
+            <w:r>
+              <w:rPr>
+                <w:rFonts w:ascii="Calibri" w:eastAsia="Arial" w:hAnsi="Calibri" w:cs="Calibri"/>
+                <w:sz w:val="18"/>
+                <w:szCs w:val="18"/>
+              </w:rPr>
+              <w:t>)=true, Size=0; Size=1 after insert</w:t>
             </w:r>
           </w:p>
         </w:tc>
@@ -7820,7 +8388,25 @@
                 <w:sz w:val="18"/>
                 <w:szCs w:val="18"/>
               </w:rPr>
-              <w:t>All findable after resize; resets to empty</w:t>
+              <w:t xml:space="preserve">All findable after </w:t>
+            </w:r>
+            <w:proofErr w:type="gramStart"/>
+            <w:r>
+              <w:rPr>
+                <w:rFonts w:ascii="Calibri" w:eastAsia="Arial" w:hAnsi="Calibri" w:cs="Calibri"/>
+                <w:sz w:val="18"/>
+                <w:szCs w:val="18"/>
+              </w:rPr>
+              <w:t>resize</w:t>
+            </w:r>
+            <w:proofErr w:type="gramEnd"/>
+            <w:r>
+              <w:rPr>
+                <w:rFonts w:ascii="Calibri" w:eastAsia="Arial" w:hAnsi="Calibri" w:cs="Calibri"/>
+                <w:sz w:val="18"/>
+                <w:szCs w:val="18"/>
+              </w:rPr>
+              <w:t>; resets to empty</w:t>
             </w:r>
           </w:p>
         </w:tc>
@@ -8011,7 +8597,25 @@
                 <w:sz w:val="18"/>
                 <w:szCs w:val="18"/>
               </w:rPr>
-              <w:t>Failed logins; reset; auto-unlock</w:t>
+              <w:t xml:space="preserve">Failed </w:t>
+            </w:r>
+            <w:proofErr w:type="gramStart"/>
+            <w:r>
+              <w:rPr>
+                <w:rFonts w:ascii="Calibri" w:eastAsia="Arial" w:hAnsi="Calibri" w:cs="Calibri"/>
+                <w:sz w:val="18"/>
+                <w:szCs w:val="18"/>
+              </w:rPr>
+              <w:t>logins</w:t>
+            </w:r>
+            <w:proofErr w:type="gramEnd"/>
+            <w:r>
+              <w:rPr>
+                <w:rFonts w:ascii="Calibri" w:eastAsia="Arial" w:hAnsi="Calibri" w:cs="Calibri"/>
+                <w:sz w:val="18"/>
+                <w:szCs w:val="18"/>
+              </w:rPr>
+              <w:t>; reset; auto-unlock</w:t>
             </w:r>
           </w:p>
         </w:tc>
@@ -8507,7 +9111,25 @@
                 <w:sz w:val="18"/>
                 <w:szCs w:val="18"/>
               </w:rPr>
-              <w:t>Min 4 auctions sorted; correct auction or null</w:t>
+              <w:t xml:space="preserve">Min 4 auctions </w:t>
+            </w:r>
+            <w:proofErr w:type="gramStart"/>
+            <w:r>
+              <w:rPr>
+                <w:rFonts w:ascii="Calibri" w:eastAsia="Arial" w:hAnsi="Calibri" w:cs="Calibri"/>
+                <w:sz w:val="18"/>
+                <w:szCs w:val="18"/>
+              </w:rPr>
+              <w:t>sorted;</w:t>
+            </w:r>
+            <w:proofErr w:type="gramEnd"/>
+            <w:r>
+              <w:rPr>
+                <w:rFonts w:ascii="Calibri" w:eastAsia="Arial" w:hAnsi="Calibri" w:cs="Calibri"/>
+                <w:sz w:val="18"/>
+                <w:szCs w:val="18"/>
+              </w:rPr>
+              <w:t xml:space="preserve"> correct auction or null</w:t>
             </w:r>
           </w:p>
         </w:tc>
@@ -8568,6 +9190,7 @@
               <w:t xml:space="preserve">; </w:t>
             </w:r>
             <w:proofErr w:type="spellStart"/>
+            <w:proofErr w:type="gramStart"/>
             <w:r>
               <w:rPr>
                 <w:rFonts w:ascii="Calibri" w:eastAsia="Arial" w:hAnsi="Calibri" w:cs="Calibri"/>
@@ -8583,7 +9206,16 @@
                 <w:sz w:val="18"/>
                 <w:szCs w:val="18"/>
               </w:rPr>
-              <w:t>()</w:t>
+              <w:t>(</w:t>
+            </w:r>
+            <w:proofErr w:type="gramEnd"/>
+            <w:r>
+              <w:rPr>
+                <w:rFonts w:ascii="Calibri" w:eastAsia="Arial" w:hAnsi="Calibri" w:cs="Calibri"/>
+                <w:sz w:val="18"/>
+                <w:szCs w:val="18"/>
+              </w:rPr>
+              <w:t>)</w:t>
             </w:r>
           </w:p>
         </w:tc>
@@ -8874,7 +9506,25 @@
                 <w:sz w:val="18"/>
                 <w:szCs w:val="18"/>
               </w:rPr>
-              <w:t xml:space="preserve">3 users created; </w:t>
+              <w:t xml:space="preserve">3 users </w:t>
+            </w:r>
+            <w:proofErr w:type="gramStart"/>
+            <w:r>
+              <w:rPr>
+                <w:rFonts w:ascii="Calibri" w:eastAsia="Arial" w:hAnsi="Calibri" w:cs="Calibri"/>
+                <w:sz w:val="18"/>
+                <w:szCs w:val="18"/>
+              </w:rPr>
+              <w:t>created;</w:t>
+            </w:r>
+            <w:proofErr w:type="gramEnd"/>
+            <w:r>
+              <w:rPr>
+                <w:rFonts w:ascii="Calibri" w:eastAsia="Arial" w:hAnsi="Calibri" w:cs="Calibri"/>
+                <w:sz w:val="18"/>
+                <w:szCs w:val="18"/>
+              </w:rPr>
+              <w:t xml:space="preserve"> </w:t>
             </w:r>
             <w:proofErr w:type="spellStart"/>
             <w:r>
@@ -9174,7 +9824,25 @@
                 <w:sz w:val="18"/>
                 <w:szCs w:val="18"/>
               </w:rPr>
-              <w:t>Account created successfully. User can log in with new credentials.</w:t>
+              <w:t xml:space="preserve">Account created successfully. </w:t>
+            </w:r>
+            <w:proofErr w:type="gramStart"/>
+            <w:r>
+              <w:rPr>
+                <w:rFonts w:ascii="Calibri" w:hAnsi="Calibri" w:cs="Calibri"/>
+                <w:sz w:val="18"/>
+                <w:szCs w:val="18"/>
+              </w:rPr>
+              <w:t>User</w:t>
+            </w:r>
+            <w:proofErr w:type="gramEnd"/>
+            <w:r>
+              <w:rPr>
+                <w:rFonts w:ascii="Calibri" w:hAnsi="Calibri" w:cs="Calibri"/>
+                <w:sz w:val="18"/>
+                <w:szCs w:val="18"/>
+              </w:rPr>
+              <w:t xml:space="preserve"> can log in with new credentials.</w:t>
             </w:r>
           </w:p>
         </w:tc>
@@ -9310,7 +9978,25 @@
                 <w:sz w:val="18"/>
                 <w:szCs w:val="18"/>
               </w:rPr>
-              <w:t>Error message displayed. No duplicate account created.</w:t>
+              <w:t xml:space="preserve">Error message displayed. No duplicate </w:t>
+            </w:r>
+            <w:proofErr w:type="gramStart"/>
+            <w:r>
+              <w:rPr>
+                <w:rFonts w:ascii="Calibri" w:hAnsi="Calibri" w:cs="Calibri"/>
+                <w:sz w:val="18"/>
+                <w:szCs w:val="18"/>
+              </w:rPr>
+              <w:t>account</w:t>
+            </w:r>
+            <w:proofErr w:type="gramEnd"/>
+            <w:r>
+              <w:rPr>
+                <w:rFonts w:ascii="Calibri" w:hAnsi="Calibri" w:cs="Calibri"/>
+                <w:sz w:val="18"/>
+                <w:szCs w:val="18"/>
+              </w:rPr>
+              <w:t xml:space="preserve"> created.</w:t>
             </w:r>
           </w:p>
         </w:tc>
@@ -9422,7 +10108,43 @@
                 <w:sz w:val="18"/>
                 <w:szCs w:val="18"/>
               </w:rPr>
-              <w:t>Enter wrong password five times for a valid account. Then attempt login with correct password.</w:t>
+              <w:t xml:space="preserve">Enter wrong password five times for a valid account. </w:t>
+            </w:r>
+            <w:proofErr w:type="gramStart"/>
+            <w:r>
+              <w:rPr>
+                <w:rFonts w:ascii="Calibri" w:hAnsi="Calibri" w:cs="Calibri"/>
+                <w:sz w:val="18"/>
+                <w:szCs w:val="18"/>
+              </w:rPr>
+              <w:t>Then</w:t>
+            </w:r>
+            <w:proofErr w:type="gramEnd"/>
+            <w:r>
+              <w:rPr>
+                <w:rFonts w:ascii="Calibri" w:hAnsi="Calibri" w:cs="Calibri"/>
+                <w:sz w:val="18"/>
+                <w:szCs w:val="18"/>
+              </w:rPr>
+              <w:t xml:space="preserve"> </w:t>
+            </w:r>
+            <w:proofErr w:type="gramStart"/>
+            <w:r>
+              <w:rPr>
+                <w:rFonts w:ascii="Calibri" w:hAnsi="Calibri" w:cs="Calibri"/>
+                <w:sz w:val="18"/>
+                <w:szCs w:val="18"/>
+              </w:rPr>
+              <w:t>attempt</w:t>
+            </w:r>
+            <w:proofErr w:type="gramEnd"/>
+            <w:r>
+              <w:rPr>
+                <w:rFonts w:ascii="Calibri" w:hAnsi="Calibri" w:cs="Calibri"/>
+                <w:sz w:val="18"/>
+                <w:szCs w:val="18"/>
+              </w:rPr>
+              <w:t xml:space="preserve"> login with correct password.</w:t>
             </w:r>
           </w:p>
         </w:tc>
@@ -9870,7 +10592,25 @@
                 <w:sz w:val="18"/>
                 <w:szCs w:val="18"/>
               </w:rPr>
-              <w:t>New bid accepted and added to the list of bid history on property listing page.</w:t>
+              <w:t xml:space="preserve">New </w:t>
+            </w:r>
+            <w:proofErr w:type="gramStart"/>
+            <w:r>
+              <w:rPr>
+                <w:rFonts w:ascii="Calibri" w:hAnsi="Calibri" w:cs="Calibri"/>
+                <w:sz w:val="18"/>
+                <w:szCs w:val="18"/>
+              </w:rPr>
+              <w:t>bid</w:t>
+            </w:r>
+            <w:proofErr w:type="gramEnd"/>
+            <w:r>
+              <w:rPr>
+                <w:rFonts w:ascii="Calibri" w:hAnsi="Calibri" w:cs="Calibri"/>
+                <w:sz w:val="18"/>
+                <w:szCs w:val="18"/>
+              </w:rPr>
+              <w:t xml:space="preserve"> accepted and added to the list of bid history on property listing page.</w:t>
             </w:r>
           </w:p>
         </w:tc>
@@ -10291,7 +11031,25 @@
           <w:sz w:val="22"/>
           <w:szCs w:val="22"/>
         </w:rPr>
-        <w:t>To conclude, MainsAuction achieved its goal of delivering a secure and functional property liquidation auction platform, with custom data structures forming the backbone of the system. The Binary Search Tree, Hash Table, and Linked List each performed as intended, and the combination of 91 unit tests and manual system testing ensured that the key logic and edge cases were handled correctly. The platform support</w:t>
+        <w:t xml:space="preserve">To conclude, MainsAuction achieved its goal of delivering a secure and functional property liquidation auction platform, with custom data structures forming the backbone of the system. The Binary Search Tree, Hash Table, and Linked List each performed as intended, and the combination of </w:t>
+      </w:r>
+      <w:proofErr w:type="gramStart"/>
+      <w:r>
+        <w:rPr>
+          <w:rFonts w:ascii="Calibri" w:hAnsi="Calibri" w:cs="Calibri"/>
+          <w:sz w:val="22"/>
+          <w:szCs w:val="22"/>
+        </w:rPr>
+        <w:t>91 unit</w:t>
+      </w:r>
+      <w:proofErr w:type="gramEnd"/>
+      <w:r>
+        <w:rPr>
+          <w:rFonts w:ascii="Calibri" w:hAnsi="Calibri" w:cs="Calibri"/>
+          <w:sz w:val="22"/>
+          <w:szCs w:val="22"/>
+        </w:rPr>
+        <w:t xml:space="preserve"> tests and manual system testing ensured that the key logic and edge cases were handled correctly. The platform support</w:t>
       </w:r>
       <w:r>
         <w:rPr>
@@ -10593,6 +11351,7 @@
         <w:t xml:space="preserve">, C.E., Rivest, R.L. and Stein, C. (2022) Introduction to Algorithms. 4th </w:t>
       </w:r>
       <w:proofErr w:type="spellStart"/>
+      <w:proofErr w:type="gramStart"/>
       <w:r>
         <w:rPr>
           <w:rFonts w:ascii="Calibri" w:hAnsi="Calibri" w:cs="Calibri"/>
@@ -10600,6 +11359,7 @@
         <w:t>edn</w:t>
       </w:r>
       <w:proofErr w:type="spellEnd"/>
+      <w:proofErr w:type="gramEnd"/>
       <w:r>
         <w:rPr>
           <w:rFonts w:ascii="Calibri" w:hAnsi="Calibri" w:cs="Calibri"/>
@@ -10827,6 +11587,7 @@
         <w:t xml:space="preserve">Knuth, D.E. (1998) The Art of Computer Programming, Volume 3: Sorting and Searching. 2nd </w:t>
       </w:r>
       <w:proofErr w:type="spellStart"/>
+      <w:proofErr w:type="gramStart"/>
       <w:r>
         <w:rPr>
           <w:rFonts w:ascii="Calibri" w:hAnsi="Calibri" w:cs="Calibri"/>
@@ -10834,6 +11595,7 @@
         <w:t>edn</w:t>
       </w:r>
       <w:proofErr w:type="spellEnd"/>
+      <w:proofErr w:type="gramEnd"/>
       <w:r>
         <w:rPr>
           <w:rFonts w:ascii="Calibri" w:hAnsi="Calibri" w:cs="Calibri"/>
@@ -11024,6 +11786,7 @@
         <w:t xml:space="preserve">Sedgewick, R. and Wayne, K. (2011) Algorithms. 4th </w:t>
       </w:r>
       <w:proofErr w:type="spellStart"/>
+      <w:proofErr w:type="gramStart"/>
       <w:r>
         <w:rPr>
           <w:rFonts w:ascii="Calibri" w:hAnsi="Calibri" w:cs="Calibri"/>
@@ -11031,6 +11794,7 @@
         <w:t>edn</w:t>
       </w:r>
       <w:proofErr w:type="spellEnd"/>
+      <w:proofErr w:type="gramEnd"/>
       <w:r>
         <w:rPr>
           <w:rFonts w:ascii="Calibri" w:hAnsi="Calibri" w:cs="Calibri"/>

</xml_diff>